<commit_message>
feat: add battle card icons and skill voice preview
</commit_message>
<xml_diff>
--- a/docs/GAME_AUDIO_DESIGN.docx
+++ b/docs/GAME_AUDIO_DESIGN.docx
@@ -49,7 +49,7 @@
           <w:color w:val="667085"/>
           <w:sz w:val="20"/>
         </w:rPr>
-        <w:t>版本 v1.0  |  状态：已确认实装  |  2026-07-12</w:t>
+        <w:t>版本 v1.1  |  状态：运行时已实装，代表语音待评审  |  2026-08-08</w:t>
       </w:r>
     </w:p>
     <w:p>
@@ -5321,7 +5321,697 @@
           <w:color w:val="2E74B5"/>
           <w:sz w:val="32"/>
         </w:rPr>
-        <w:t>7. 验收标准</w:t>
+        <w:t>7. 动物技能语音与战斗卡牌联动</w:t>
+      </w:r>
+    </w:p>
+    <w:p>
+      <w:pPr>
+        <w:pStyle w:val="Heading2"/>
+      </w:pPr>
+      <w:r>
+        <w:rPr>
+          <w:rFonts w:ascii="Calibri" w:hAnsi="Calibri" w:eastAsia="Microsoft YaHei"/>
+          <w:b w:val="0"/>
+          <w:i w:val="0"/>
+          <w:color w:val="2E74B5"/>
+          <w:sz w:val="26"/>
+        </w:rPr>
+        <w:t>7.1 触发和生命周期</w:t>
+      </w:r>
+    </w:p>
+    <w:p>
+      <w:pPr>
+        <w:pStyle w:val="ListBullet"/>
+      </w:pPr>
+      <w:r>
+        <w:rPr>
+          <w:rFonts w:ascii="Calibri" w:hAnsi="Calibri" w:eastAsia="Microsoft YaHei"/>
+          <w:b w:val="0"/>
+          <w:i w:val="0"/>
+          <w:color w:val="202124"/>
+          <w:sz w:val="22"/>
+        </w:rPr>
+        <w:t xml:space="preserve">只有点击动物营地 </w:t>
+      </w:r>
+      <w:r>
+        <w:rPr>
+          <w:rFonts w:ascii="Calibri" w:hAnsi="Calibri" w:eastAsia="Microsoft YaHei"/>
+          <w:b/>
+          <w:i w:val="0"/>
+          <w:color w:val="17365D"/>
+          <w:sz w:val="22"/>
+        </w:rPr>
+        <w:t>barracks/hall</w:t>
+      </w:r>
+      <w:r>
+        <w:rPr>
+          <w:rFonts w:ascii="Calibri" w:hAnsi="Calibri" w:eastAsia="Microsoft YaHei"/>
+          <w:b w:val="0"/>
+          <w:i w:val="0"/>
+          <w:color w:val="202124"/>
+          <w:sz w:val="22"/>
+        </w:rPr>
+        <w:t xml:space="preserve"> 时才播放其 </w:t>
+      </w:r>
+      <w:r>
+        <w:rPr>
+          <w:rFonts w:ascii="Calibri" w:hAnsi="Calibri" w:eastAsia="Microsoft YaHei"/>
+          <w:b/>
+          <w:i w:val="0"/>
+          <w:color w:val="17365D"/>
+          <w:sz w:val="22"/>
+        </w:rPr>
+        <w:t>site_card</w:t>
+      </w:r>
+      <w:r>
+        <w:rPr>
+          <w:rFonts w:ascii="Calibri" w:hAnsi="Calibri" w:eastAsia="Microsoft YaHei"/>
+          <w:b w:val="0"/>
+          <w:i w:val="0"/>
+          <w:color w:val="202124"/>
+          <w:sz w:val="22"/>
+        </w:rPr>
+        <w:t xml:space="preserve"> 对应动物的技能语音；防御塔、金矿和基地不映射动物，也不播放语音。</w:t>
+      </w:r>
+    </w:p>
+    <w:p>
+      <w:pPr>
+        <w:pStyle w:val="ListBullet"/>
+      </w:pPr>
+      <w:r>
+        <w:rPr>
+          <w:rFonts w:ascii="Calibri" w:hAnsi="Calibri" w:eastAsia="Microsoft YaHei"/>
+          <w:b w:val="0"/>
+          <w:i w:val="0"/>
+          <w:color w:val="202124"/>
+          <w:sz w:val="22"/>
+        </w:rPr>
+        <w:t xml:space="preserve">营地动物卡在战斗底部显示 </w:t>
+      </w:r>
+      <w:r>
+        <w:rPr>
+          <w:rFonts w:ascii="Calibri" w:hAnsi="Calibri" w:eastAsia="Microsoft YaHei"/>
+          <w:b/>
+          <w:i w:val="0"/>
+          <w:color w:val="17365D"/>
+          <w:sz w:val="22"/>
+        </w:rPr>
+        <w:t>3.0s</w:t>
+      </w:r>
+      <w:r>
+        <w:rPr>
+          <w:rFonts w:ascii="Calibri" w:hAnsi="Calibri" w:eastAsia="Microsoft YaHei"/>
+          <w:b w:val="0"/>
+          <w:i w:val="0"/>
+          <w:color w:val="202124"/>
+          <w:sz w:val="22"/>
+        </w:rPr>
+        <w:t xml:space="preserve"> 后消失；语音与画面计时独立，允许自然播完。再次点击任意营地时先中断旧语音，再从头播放新语音。</w:t>
+      </w:r>
+    </w:p>
+    <w:p>
+      <w:pPr>
+        <w:pStyle w:val="ListBullet"/>
+      </w:pPr>
+      <w:r>
+        <w:rPr>
+          <w:rFonts w:ascii="Calibri" w:hAnsi="Calibri" w:eastAsia="Microsoft YaHei"/>
+          <w:b w:val="0"/>
+          <w:i w:val="0"/>
+          <w:color w:val="202124"/>
+          <w:sz w:val="22"/>
+        </w:rPr>
+        <w:t>点击动物、空地、非动物建筑或离开战斗时清理临时营地卡牌；离开战斗、重新开始、结算或关闭音效时立即停止技能语音。</w:t>
+      </w:r>
+    </w:p>
+    <w:p>
+      <w:pPr>
+        <w:pStyle w:val="ListBullet"/>
+      </w:pPr>
+      <w:r>
+        <w:rPr>
+          <w:rFonts w:ascii="Calibri" w:hAnsi="Calibri" w:eastAsia="Microsoft YaHei"/>
+          <w:b w:val="0"/>
+          <w:i w:val="0"/>
+          <w:color w:val="202124"/>
+          <w:sz w:val="22"/>
+        </w:rPr>
+        <w:t>语音受现有“音效”开关控制，不新增设置页选项。</w:t>
+      </w:r>
+    </w:p>
+    <w:p>
+      <w:pPr>
+        <w:pStyle w:val="Heading2"/>
+      </w:pPr>
+      <w:r>
+        <w:rPr>
+          <w:rFonts w:ascii="Calibri" w:hAnsi="Calibri" w:eastAsia="Microsoft YaHei"/>
+          <w:b w:val="0"/>
+          <w:i w:val="0"/>
+          <w:color w:val="2E74B5"/>
+          <w:sz w:val="26"/>
+        </w:rPr>
+        <w:t>7.2 文本与范围标签</w:t>
+      </w:r>
+    </w:p>
+    <w:p>
+      <w:pPr>
+        <w:pStyle w:val="ListBullet"/>
+      </w:pPr>
+      <w:r>
+        <w:rPr>
+          <w:rFonts w:ascii="Calibri" w:hAnsi="Calibri" w:eastAsia="Microsoft YaHei"/>
+          <w:b/>
+          <w:i w:val="0"/>
+          <w:color w:val="17365D"/>
+          <w:sz w:val="22"/>
+        </w:rPr>
+        <w:t>config/tables/cards.csv::skill_text</w:t>
+      </w:r>
+      <w:r>
+        <w:rPr>
+          <w:rFonts w:ascii="Calibri" w:hAnsi="Calibri" w:eastAsia="Microsoft YaHei"/>
+          <w:b w:val="0"/>
+          <w:i w:val="0"/>
+          <w:color w:val="202124"/>
+          <w:sz w:val="22"/>
+        </w:rPr>
+        <w:t xml:space="preserve"> 是技能语音文字真源，不能以 </w:t>
+      </w:r>
+      <w:r>
+        <w:rPr>
+          <w:rFonts w:ascii="Calibri" w:hAnsi="Calibri" w:eastAsia="Microsoft YaHei"/>
+          <w:b/>
+          <w:i w:val="0"/>
+          <w:color w:val="17365D"/>
+          <w:sz w:val="22"/>
+        </w:rPr>
+        <w:t>skill_id</w:t>
+      </w:r>
+      <w:r>
+        <w:rPr>
+          <w:rFonts w:ascii="Calibri" w:hAnsi="Calibri" w:eastAsia="Microsoft YaHei"/>
+          <w:b w:val="0"/>
+          <w:i w:val="0"/>
+          <w:color w:val="202124"/>
+          <w:sz w:val="22"/>
+        </w:rPr>
+        <w:t xml:space="preserve"> 是否为空作为判断条件，也不能朗读结构化字段推导出的文案。</w:t>
+      </w:r>
+    </w:p>
+    <w:p>
+      <w:pPr>
+        <w:pStyle w:val="ListBullet"/>
+      </w:pPr>
+      <w:r>
+        <w:rPr>
+          <w:rFonts w:ascii="Calibri" w:hAnsi="Calibri" w:eastAsia="Microsoft YaHei"/>
+          <w:b w:val="0"/>
+          <w:i w:val="0"/>
+          <w:color w:val="202124"/>
+          <w:sz w:val="22"/>
+        </w:rPr>
+        <w:t>动物卡不再独立显示近战/远程属性。远程或超远程在技能区显示相应范围标签；语音只朗读真实可见的技能信息。</w:t>
+      </w:r>
+    </w:p>
+    <w:p>
+      <w:pPr>
+        <w:pStyle w:val="ListBullet"/>
+      </w:pPr>
+      <w:r>
+        <w:rPr>
+          <w:rFonts w:ascii="Calibri" w:hAnsi="Calibri" w:eastAsia="Microsoft YaHei"/>
+          <w:b/>
+          <w:i w:val="0"/>
+          <w:color w:val="17365D"/>
+          <w:sz w:val="22"/>
+        </w:rPr>
+        <w:t>skill_text</w:t>
+      </w:r>
+      <w:r>
+        <w:rPr>
+          <w:rFonts w:ascii="Calibri" w:hAnsi="Calibri" w:eastAsia="Microsoft YaHei"/>
+          <w:b w:val="0"/>
+          <w:i w:val="0"/>
+          <w:color w:val="202124"/>
+          <w:sz w:val="22"/>
+        </w:rPr>
+        <w:t xml:space="preserve"> 为空时一律保持语音静默；远程但空描述时只保留“远程/超远程”可见标签，不朗读范围标签，也不杜撰“无技能”。</w:t>
+      </w:r>
+    </w:p>
+    <w:p>
+      <w:pPr>
+        <w:pStyle w:val="ListBullet"/>
+      </w:pPr>
+      <w:r>
+        <w:rPr>
+          <w:rFonts w:ascii="Calibri" w:hAnsi="Calibri" w:eastAsia="Microsoft YaHei"/>
+          <w:b w:val="0"/>
+          <w:i w:val="0"/>
+          <w:color w:val="202124"/>
+          <w:sz w:val="22"/>
+        </w:rPr>
+        <w:t>语音生成清单必须记录动物 ID、角色声线、资源路径、源文本哈希和制作状态；卡牌描述变化后旧音频必须被检查为过期。</w:t>
+      </w:r>
+    </w:p>
+    <w:p>
+      <w:pPr>
+        <w:pStyle w:val="Heading2"/>
+      </w:pPr>
+      <w:r>
+        <w:rPr>
+          <w:rFonts w:ascii="Calibri" w:hAnsi="Calibri" w:eastAsia="Microsoft YaHei"/>
+          <w:b w:val="0"/>
+          <w:i w:val="0"/>
+          <w:color w:val="2E74B5"/>
+          <w:sz w:val="26"/>
+        </w:rPr>
+        <w:t>7.3 播放架构</w:t>
+      </w:r>
+    </w:p>
+    <w:p>
+      <w:pPr>
+        <w:pStyle w:val="ListBullet"/>
+      </w:pPr>
+      <w:r>
+        <w:rPr>
+          <w:rFonts w:ascii="Calibri" w:hAnsi="Calibri" w:eastAsia="Microsoft YaHei"/>
+          <w:b w:val="0"/>
+          <w:i w:val="0"/>
+          <w:color w:val="202124"/>
+          <w:sz w:val="22"/>
+        </w:rPr>
+        <w:t xml:space="preserve">新增一个独占 </w:t>
+      </w:r>
+      <w:r>
+        <w:rPr>
+          <w:rFonts w:ascii="Calibri" w:hAnsi="Calibri" w:eastAsia="Microsoft YaHei"/>
+          <w:b/>
+          <w:i w:val="0"/>
+          <w:color w:val="17365D"/>
+          <w:sz w:val="22"/>
+        </w:rPr>
+        <w:t>Voice</w:t>
+      </w:r>
+      <w:r>
+        <w:rPr>
+          <w:rFonts w:ascii="Calibri" w:hAnsi="Calibri" w:eastAsia="Microsoft YaHei"/>
+          <w:b w:val="0"/>
+          <w:i w:val="0"/>
+          <w:color w:val="202124"/>
+          <w:sz w:val="22"/>
+        </w:rPr>
+        <w:t xml:space="preserve"> 总线与一个 </w:t>
+      </w:r>
+      <w:r>
+        <w:rPr>
+          <w:rFonts w:ascii="Calibri" w:hAnsi="Calibri" w:eastAsia="Microsoft YaHei"/>
+          <w:b/>
+          <w:i w:val="0"/>
+          <w:color w:val="17365D"/>
+          <w:sz w:val="22"/>
+        </w:rPr>
+        <w:t>AudioStreamPlayer</w:t>
+      </w:r>
+      <w:r>
+        <w:rPr>
+          <w:rFonts w:ascii="Calibri" w:hAnsi="Calibri" w:eastAsia="Microsoft YaHei"/>
+          <w:b w:val="0"/>
+          <w:i w:val="0"/>
+          <w:color w:val="202124"/>
+          <w:sz w:val="22"/>
+        </w:rPr>
+        <w:t>，不占用 12 路战斗 SFX 池，普通攻击/受击音效不能抢占技能语音。</w:t>
+      </w:r>
+    </w:p>
+    <w:p>
+      <w:pPr>
+        <w:pStyle w:val="ListBullet"/>
+      </w:pPr>
+      <w:r>
+        <w:rPr>
+          <w:rFonts w:ascii="Calibri" w:hAnsi="Calibri" w:eastAsia="Microsoft YaHei"/>
+          <w:b w:val="0"/>
+          <w:i w:val="0"/>
+          <w:color w:val="202124"/>
+          <w:sz w:val="22"/>
+        </w:rPr>
+        <w:t xml:space="preserve">播放接口为 </w:t>
+      </w:r>
+      <w:r>
+        <w:rPr>
+          <w:rFonts w:ascii="Calibri" w:hAnsi="Calibri" w:eastAsia="Microsoft YaHei"/>
+          <w:b/>
+          <w:i w:val="0"/>
+          <w:color w:val="17365D"/>
+          <w:sz w:val="22"/>
+        </w:rPr>
+        <w:t>play_card_skill_voice(card_id)</w:t>
+      </w:r>
+      <w:r>
+        <w:rPr>
+          <w:rFonts w:ascii="Calibri" w:hAnsi="Calibri" w:eastAsia="Microsoft YaHei"/>
+          <w:b w:val="0"/>
+          <w:i w:val="0"/>
+          <w:color w:val="202124"/>
+          <w:sz w:val="22"/>
+        </w:rPr>
+        <w:t xml:space="preserve"> 与 </w:t>
+      </w:r>
+      <w:r>
+        <w:rPr>
+          <w:rFonts w:ascii="Calibri" w:hAnsi="Calibri" w:eastAsia="Microsoft YaHei"/>
+          <w:b/>
+          <w:i w:val="0"/>
+          <w:color w:val="17365D"/>
+          <w:sz w:val="22"/>
+        </w:rPr>
+        <w:t>stop_card_skill_voice()</w:t>
+      </w:r>
+      <w:r>
+        <w:rPr>
+          <w:rFonts w:ascii="Calibri" w:hAnsi="Calibri" w:eastAsia="Microsoft YaHei"/>
+          <w:b w:val="0"/>
+          <w:i w:val="0"/>
+          <w:color w:val="202124"/>
+          <w:sz w:val="22"/>
+        </w:rPr>
+        <w:t>；新语音总是替换当前语音。</w:t>
+      </w:r>
+    </w:p>
+    <w:p>
+      <w:pPr>
+        <w:pStyle w:val="ListBullet"/>
+      </w:pPr>
+      <w:r>
+        <w:rPr>
+          <w:rFonts w:ascii="Calibri" w:hAnsi="Calibri" w:eastAsia="Microsoft YaHei"/>
+          <w:b w:val="0"/>
+          <w:i w:val="0"/>
+          <w:color w:val="202124"/>
+          <w:sz w:val="22"/>
+        </w:rPr>
+        <w:t>技能语音播放时使用独立 music-duck 分量，不能覆盖暂停、结算等已有 duck 状态；播放结束或中断后只恢复语音自己的 duck 分量。</w:t>
+      </w:r>
+    </w:p>
+    <w:p>
+      <w:pPr>
+        <w:pStyle w:val="ListBullet"/>
+      </w:pPr>
+      <w:r>
+        <w:rPr>
+          <w:rFonts w:ascii="Calibri" w:hAnsi="Calibri" w:eastAsia="Microsoft YaHei"/>
+          <w:b w:val="0"/>
+          <w:i w:val="0"/>
+          <w:color w:val="202124"/>
+          <w:sz w:val="22"/>
+        </w:rPr>
+        <w:t>缺失、过期或待审核资源必须安全降级为静默，不能阻止卡牌显示、点击和战斗模拟。</w:t>
+      </w:r>
+    </w:p>
+    <w:p>
+      <w:pPr>
+        <w:pStyle w:val="Heading2"/>
+      </w:pPr>
+      <w:r>
+        <w:rPr>
+          <w:rFonts w:ascii="Calibri" w:hAnsi="Calibri" w:eastAsia="Microsoft YaHei"/>
+          <w:b w:val="0"/>
+          <w:i w:val="0"/>
+          <w:color w:val="2E74B5"/>
+          <w:sz w:val="26"/>
+        </w:rPr>
+        <w:t>7.4 语音制作与质量门禁</w:t>
+      </w:r>
+    </w:p>
+    <w:p>
+      <w:pPr>
+        <w:pStyle w:val="ListBullet"/>
+      </w:pPr>
+      <w:r>
+        <w:rPr>
+          <w:rFonts w:ascii="Calibri" w:hAnsi="Calibri" w:eastAsia="Microsoft YaHei"/>
+          <w:b w:val="0"/>
+          <w:i w:val="0"/>
+          <w:color w:val="202124"/>
+          <w:sz w:val="22"/>
+        </w:rPr>
+        <w:t xml:space="preserve">源配置为 </w:t>
+      </w:r>
+      <w:r>
+        <w:rPr>
+          <w:rFonts w:ascii="Calibri" w:hAnsi="Calibri" w:eastAsia="Microsoft YaHei"/>
+          <w:b/>
+          <w:i w:val="0"/>
+          <w:color w:val="17365D"/>
+          <w:sz w:val="22"/>
+        </w:rPr>
+        <w:t>config/tables/card_skill_voices.csv</w:t>
+      </w:r>
+      <w:r>
+        <w:rPr>
+          <w:rFonts w:ascii="Calibri" w:hAnsi="Calibri" w:eastAsia="Microsoft YaHei"/>
+          <w:b w:val="0"/>
+          <w:i w:val="0"/>
+          <w:color w:val="202124"/>
+          <w:sz w:val="22"/>
+        </w:rPr>
+        <w:t xml:space="preserve">，运行时资源位于 </w:t>
+      </w:r>
+      <w:r>
+        <w:rPr>
+          <w:rFonts w:ascii="Calibri" w:hAnsi="Calibri" w:eastAsia="Microsoft YaHei"/>
+          <w:b/>
+          <w:i w:val="0"/>
+          <w:color w:val="17365D"/>
+          <w:sz w:val="22"/>
+        </w:rPr>
+        <w:t>assets/audio/voices/skills/zh_cn/</w:t>
+      </w:r>
+      <w:r>
+        <w:rPr>
+          <w:rFonts w:ascii="Calibri" w:hAnsi="Calibri" w:eastAsia="Microsoft YaHei"/>
+          <w:b w:val="0"/>
+          <w:i w:val="0"/>
+          <w:color w:val="202124"/>
+          <w:sz w:val="22"/>
+        </w:rPr>
+        <w:t>，生成清单位于同目录。</w:t>
+      </w:r>
+    </w:p>
+    <w:p>
+      <w:pPr>
+        <w:pStyle w:val="ListBullet"/>
+      </w:pPr>
+      <w:r>
+        <w:rPr>
+          <w:rFonts w:ascii="Calibri" w:hAnsi="Calibri" w:eastAsia="Microsoft YaHei"/>
+          <w:b w:val="0"/>
+          <w:i w:val="0"/>
+          <w:color w:val="202124"/>
+          <w:sz w:val="22"/>
+        </w:rPr>
+        <w:t>每只动物固定一个角色画像；小型群居、鸟类侦察、两栖控制、温和辅助、机敏型、猛兽、巨型动物、水生动物、灵长类与传奇单位使用不同的声音、语速和音高组合，运行时不随机换声线。</w:t>
+      </w:r>
+    </w:p>
+    <w:p>
+      <w:pPr>
+        <w:pStyle w:val="ListBullet"/>
+      </w:pPr>
+      <w:r>
+        <w:rPr>
+          <w:rFonts w:ascii="Calibri" w:hAnsi="Calibri" w:eastAsia="Microsoft YaHei"/>
+          <w:b w:val="0"/>
+          <w:i w:val="0"/>
+          <w:color w:val="202124"/>
+          <w:sz w:val="22"/>
+        </w:rPr>
+        <w:t xml:space="preserve">当前离线构建可使用本机 Microsoft Huihui、Yaoyao、Kangkang 三种中文系统声音制作可运行切片；这些资源标记为 </w:t>
+      </w:r>
+      <w:r>
+        <w:rPr>
+          <w:rFonts w:ascii="Calibri" w:hAnsi="Calibri" w:eastAsia="Microsoft YaHei"/>
+          <w:b/>
+          <w:i w:val="0"/>
+          <w:color w:val="17365D"/>
+          <w:sz w:val="22"/>
+        </w:rPr>
+        <w:t>prototype_generated</w:t>
+      </w:r>
+      <w:r>
+        <w:rPr>
+          <w:rFonts w:ascii="Calibri" w:hAnsi="Calibri" w:eastAsia="Microsoft YaHei"/>
+          <w:b w:val="0"/>
+          <w:i w:val="0"/>
+          <w:color w:val="202124"/>
+          <w:sz w:val="22"/>
+        </w:rPr>
+        <w:t xml:space="preserve">，必须经制作人在 Godot 运行时试听后才可改为 </w:t>
+      </w:r>
+      <w:r>
+        <w:rPr>
+          <w:rFonts w:ascii="Calibri" w:hAnsi="Calibri" w:eastAsia="Microsoft YaHei"/>
+          <w:b/>
+          <w:i w:val="0"/>
+          <w:color w:val="17365D"/>
+          <w:sz w:val="22"/>
+        </w:rPr>
+        <w:t>approved</w:t>
+      </w:r>
+      <w:r>
+        <w:rPr>
+          <w:rFonts w:ascii="Calibri" w:hAnsi="Calibri" w:eastAsia="Microsoft YaHei"/>
+          <w:b w:val="0"/>
+          <w:i w:val="0"/>
+          <w:color w:val="202124"/>
+          <w:sz w:val="22"/>
+        </w:rPr>
+        <w:t>。</w:t>
+      </w:r>
+    </w:p>
+    <w:p>
+      <w:pPr>
+        <w:pStyle w:val="ListBullet"/>
+      </w:pPr>
+      <w:r>
+        <w:rPr>
+          <w:rFonts w:ascii="Calibri" w:hAnsi="Calibri" w:eastAsia="Microsoft YaHei"/>
+          <w:b w:val="0"/>
+          <w:i w:val="0"/>
+          <w:color w:val="202124"/>
+          <w:sz w:val="22"/>
+        </w:rPr>
+        <w:t>代表切片至少覆盖小型、鸟类、辅助、猛兽、巨型、水生与传奇七类。未通过代表切片试听前，不得仅凭文件数量宣称全量语音风格已最终完成。</w:t>
+      </w:r>
+    </w:p>
+    <w:p>
+      <w:pPr>
+        <w:pStyle w:val="ListBullet"/>
+      </w:pPr>
+      <w:r>
+        <w:rPr>
+          <w:rFonts w:ascii="Calibri" w:hAnsi="Calibri" w:eastAsia="Microsoft YaHei"/>
+          <w:b w:val="0"/>
+          <w:i w:val="0"/>
+          <w:color w:val="202124"/>
+          <w:sz w:val="22"/>
+        </w:rPr>
+        <w:t xml:space="preserve">当前制作状态固定为：60 张动物制作行；9 条代表语音为 </w:t>
+      </w:r>
+      <w:r>
+        <w:rPr>
+          <w:rFonts w:ascii="Calibri" w:hAnsi="Calibri" w:eastAsia="Microsoft YaHei"/>
+          <w:b/>
+          <w:i w:val="0"/>
+          <w:color w:val="17365D"/>
+          <w:sz w:val="22"/>
+        </w:rPr>
+        <w:t>prototype_generated</w:t>
+      </w:r>
+      <w:r>
+        <w:rPr>
+          <w:rFonts w:ascii="Calibri" w:hAnsi="Calibri" w:eastAsia="Microsoft YaHei"/>
+          <w:b w:val="0"/>
+          <w:i w:val="0"/>
+          <w:color w:val="202124"/>
+          <w:sz w:val="22"/>
+        </w:rPr>
+        <w:t xml:space="preserve">，42 条有技能描述的语音为 </w:t>
+      </w:r>
+      <w:r>
+        <w:rPr>
+          <w:rFonts w:ascii="Calibri" w:hAnsi="Calibri" w:eastAsia="Microsoft YaHei"/>
+          <w:b/>
+          <w:i w:val="0"/>
+          <w:color w:val="17365D"/>
+          <w:sz w:val="22"/>
+        </w:rPr>
+        <w:t>pending_review</w:t>
+      </w:r>
+      <w:r>
+        <w:rPr>
+          <w:rFonts w:ascii="Calibri" w:hAnsi="Calibri" w:eastAsia="Microsoft YaHei"/>
+          <w:b w:val="0"/>
+          <w:i w:val="0"/>
+          <w:color w:val="202124"/>
+          <w:sz w:val="22"/>
+        </w:rPr>
+        <w:t xml:space="preserve">，9 张空 </w:t>
+      </w:r>
+      <w:r>
+        <w:rPr>
+          <w:rFonts w:ascii="Calibri" w:hAnsi="Calibri" w:eastAsia="Microsoft YaHei"/>
+          <w:b/>
+          <w:i w:val="0"/>
+          <w:color w:val="17365D"/>
+          <w:sz w:val="22"/>
+        </w:rPr>
+        <w:t>skill_text</w:t>
+      </w:r>
+      <w:r>
+        <w:rPr>
+          <w:rFonts w:ascii="Calibri" w:hAnsi="Calibri" w:eastAsia="Microsoft YaHei"/>
+          <w:b w:val="0"/>
+          <w:i w:val="0"/>
+          <w:color w:val="202124"/>
+          <w:sz w:val="22"/>
+        </w:rPr>
+        <w:t xml:space="preserve"> 动物为 </w:t>
+      </w:r>
+      <w:r>
+        <w:rPr>
+          <w:rFonts w:ascii="Calibri" w:hAnsi="Calibri" w:eastAsia="Microsoft YaHei"/>
+          <w:b/>
+          <w:i w:val="0"/>
+          <w:color w:val="17365D"/>
+          <w:sz w:val="22"/>
+        </w:rPr>
+        <w:t>silent_no_player_skill</w:t>
+      </w:r>
+      <w:r>
+        <w:rPr>
+          <w:rFonts w:ascii="Calibri" w:hAnsi="Calibri" w:eastAsia="Microsoft YaHei"/>
+          <w:b w:val="0"/>
+          <w:i w:val="0"/>
+          <w:color w:val="202124"/>
+          <w:sz w:val="22"/>
+        </w:rPr>
+        <w:t xml:space="preserve">。代表切片通过前不得批量生成或改为 </w:t>
+      </w:r>
+      <w:r>
+        <w:rPr>
+          <w:rFonts w:ascii="Calibri" w:hAnsi="Calibri" w:eastAsia="Microsoft YaHei"/>
+          <w:b/>
+          <w:i w:val="0"/>
+          <w:color w:val="17365D"/>
+          <w:sz w:val="22"/>
+        </w:rPr>
+        <w:t>approved</w:t>
+      </w:r>
+      <w:r>
+        <w:rPr>
+          <w:rFonts w:ascii="Calibri" w:hAnsi="Calibri" w:eastAsia="Microsoft YaHei"/>
+          <w:b w:val="0"/>
+          <w:i w:val="0"/>
+          <w:color w:val="202124"/>
+          <w:sz w:val="22"/>
+        </w:rPr>
+        <w:t>。</w:t>
+      </w:r>
+    </w:p>
+    <w:p>
+      <w:pPr>
+        <w:pStyle w:val="Heading1"/>
+      </w:pPr>
+      <w:r>
+        <w:rPr>
+          <w:rFonts w:ascii="Calibri" w:hAnsi="Calibri" w:eastAsia="Microsoft YaHei"/>
+          <w:b w:val="0"/>
+          <w:i w:val="0"/>
+          <w:color w:val="2E74B5"/>
+          <w:sz w:val="32"/>
+        </w:rPr>
+        <w:t>8. 验收标准</w:t>
       </w:r>
     </w:p>
     <w:p>

</xml_diff>